<commit_message>
Document PRAGMA foreign_key requirement in schema file
</commit_message>
<xml_diff>
--- a/sql/create_tables.sql.docx
+++ b/sql/create_tables.sql.docx
@@ -2,6 +2,166 @@
 <file path=word/document.xml><?xml version="1.0" encoding="utf-8"?>
 <w:document xmlns:ve="http://schemas.openxmlformats.org/markup-compatibility/2006" xmlns:o="urn:schemas-microsoft-com:office:office" xmlns:r="http://schemas.openxmlformats.org/officeDocument/2006/relationships" xmlns:v="urn:schemas-microsoft-com:vml" xmlns:wp="http://schemas.openxmlformats.org/drawingml/2006/wordprocessingDrawing" xmlns:w10="urn:schemas-microsoft-com:office:word" xmlns:w="http://schemas.openxmlformats.org/wordprocessingml/2006/main">
   <w:body>
+    <w:p>
+      <w:pPr/>
+      <w:r>
+        <w:rPr>
+          <w:rFonts w:ascii="Times" w:hAnsi="Times" w:cs="Times"/>
+          <w:sz w:val="24"/>
+          <w:sz-cs w:val="24"/>
+          <w:spacing w:val="0"/>
+          <w:color w:val="000000"/>
+        </w:rPr>
+        <w:t xml:space="preserve">-- SQLite does not enforce foreign key constraints by default.</w:t>
+      </w:r>
+      <w:r>
+        <w:rPr>
+          <w:rFonts w:ascii="Times" w:hAnsi="Times" w:cs="Times"/>
+          <w:sz w:val="24"/>
+          <w:sz-cs w:val="24"/>
+          <w:spacing w:val="0"/>
+          <w:color w:val="000000"/>
+        </w:rPr>
+        <w:t xml:space="preserve"> </w:t>
+      </w:r>
+    </w:p>
+    <w:p>
+      <w:pPr/>
+      <w:r>
+        <w:rPr>
+          <w:rFonts w:ascii="Times" w:hAnsi="Times" w:cs="Times"/>
+          <w:sz w:val="24"/>
+          <w:sz-cs w:val="24"/>
+          <w:spacing w:val="0"/>
+          <w:color w:val="000000"/>
+        </w:rPr>
+        <w:t xml:space="preserve">-- This PRAGMA must be run at the start of every session/connection</w:t>
+      </w:r>
+      <w:r>
+        <w:rPr>
+          <w:rFonts w:ascii="Times" w:hAnsi="Times" w:cs="Times"/>
+          <w:sz w:val="24"/>
+          <w:sz-cs w:val="24"/>
+          <w:spacing w:val="0"/>
+          <w:color w:val="000000"/>
+        </w:rPr>
+        <w:t xml:space="preserve"> </w:t>
+      </w:r>
+    </w:p>
+    <w:p>
+      <w:pPr/>
+      <w:r>
+        <w:rPr>
+          <w:rFonts w:ascii="Times" w:hAnsi="Times" w:cs="Times"/>
+          <w:sz w:val="24"/>
+          <w:sz-cs w:val="24"/>
+          <w:spacing w:val="0"/>
+          <w:color w:val="000000"/>
+        </w:rPr>
+        <w:t xml:space="preserve">-- (DB Browser, R via RSQLite, etc.) for referential integrity to be enforced.</w:t>
+      </w:r>
+      <w:r>
+        <w:rPr>
+          <w:rFonts w:ascii="Times" w:hAnsi="Times" w:cs="Times"/>
+          <w:sz w:val="24"/>
+          <w:sz-cs w:val="24"/>
+          <w:spacing w:val="0"/>
+          <w:color w:val="000000"/>
+        </w:rPr>
+        <w:t xml:space="preserve"> </w:t>
+      </w:r>
+      <w:r>
+        <w:rPr>
+          <w:rFonts w:ascii="Times" w:hAnsi="Times" w:cs="Times"/>
+          <w:sz w:val="24"/>
+          <w:sz-cs w:val="24"/>
+          <w:spacing w:val="0"/>
+          <w:color w:val="000000"/>
+        </w:rPr>
+        <w:t xml:space="preserve">-- It is NOT a permanent setting saved in the database file itself.</w:t>
+      </w:r>
+      <w:r>
+        <w:rPr>
+          <w:rFonts w:ascii="Times" w:hAnsi="Times" w:cs="Times"/>
+          <w:sz w:val="24"/>
+          <w:sz-cs w:val="24"/>
+          <w:spacing w:val="0"/>
+          <w:color w:val="000000"/>
+        </w:rPr>
+        <w:t xml:space="preserve"> </w:t>
+      </w:r>
+      <w:r>
+        <w:rPr>
+          <w:rFonts w:ascii="Times" w:hAnsi="Times" w:cs="Times"/>
+          <w:sz w:val="24"/>
+          <w:sz-cs w:val="24"/>
+          <w:spacing w:val="0"/>
+        </w:rPr>
+        <w:t xml:space="preserve"/>
+      </w:r>
+    </w:p>
+    <w:p>
+      <w:pPr/>
+      <w:r>
+        <w:rPr>
+          <w:rFonts w:ascii="Times" w:hAnsi="Times" w:cs="Times"/>
+          <w:sz w:val="24"/>
+          <w:sz-cs w:val="24"/>
+          <w:spacing w:val="0"/>
+        </w:rPr>
+        <w:t xml:space="preserve"/>
+      </w:r>
+    </w:p>
+    <w:p>
+      <w:pPr/>
+      <w:r>
+        <w:rPr>
+          <w:rFonts w:ascii="Times" w:hAnsi="Times" w:cs="Times"/>
+          <w:sz w:val="24"/>
+          <w:sz-cs w:val="24"/>
+          <w:spacing w:val="0"/>
+        </w:rPr>
+        <w:t xml:space="preserve">PRAGMA foreign_keys = </w:t>
+      </w:r>
+      <w:r>
+        <w:rPr>
+          <w:rFonts w:ascii="Times" w:hAnsi="Times" w:cs="Times"/>
+          <w:sz w:val="24"/>
+          <w:sz-cs w:val="24"/>
+          <w:spacing w:val="0"/>
+          <w:color w:val="BF5EF1"/>
+        </w:rPr>
+        <w:t xml:space="preserve">ON</w:t>
+      </w:r>
+      <w:r>
+        <w:rPr>
+          <w:rFonts w:ascii="Times" w:hAnsi="Times" w:cs="Times"/>
+          <w:sz w:val="24"/>
+          <w:sz-cs w:val="24"/>
+          <w:spacing w:val="0"/>
+        </w:rPr>
+        <w:t xml:space="preserve">;</w:t>
+      </w:r>
+      <w:r>
+        <w:rPr>
+          <w:rFonts w:ascii="Helvetica" w:hAnsi="Helvetica" w:cs="Helvetica"/>
+          <w:sz w:val="24"/>
+          <w:sz-cs w:val="24"/>
+        </w:rPr>
+        <w:t xml:space="preserve"/>
+      </w:r>
+    </w:p>
+    <w:p>
+      <w:pPr/>
+      <w:r>
+        <w:rPr>
+          <w:rFonts w:ascii="Helvetica" w:hAnsi="Helvetica" w:cs="Helvetica"/>
+          <w:sz w:val="24"/>
+          <w:sz-cs w:val="24"/>
+        </w:rPr>
+        <w:t xml:space="preserve"/>
+      </w:r>
+    </w:p>
     <w:p>
       <w:pPr/>
       <w:r>

</xml_diff>